<commit_message>
correciones menores a daily meeting
</commit_message>
<xml_diff>
--- a/Fase 2/Evidencias Proyeto/Evidencias de documentación/Daily meeting/Daily Meating 02_10_2026.docx
+++ b/Fase 2/Evidencias Proyeto/Evidencias de documentación/Daily meeting/Daily Meating 02_10_2026.docx
@@ -24,7 +24,7 @@
         <w:rPr>
           <w:rtl w:val="0"/>
         </w:rPr>
-        <w:t xml:space="preserve">Fecha de reunión. 01/10/2026</w:t>
+        <w:t xml:space="preserve">Fecha de reunión. 02/10/2026</w:t>
       </w:r>
     </w:p>
     <w:p>
@@ -105,7 +105,7 @@
         <w:rPr>
           <w:rtl w:val="0"/>
         </w:rPr>
-        <w:t xml:space="preserve">Cristobal Oyarzun: </w:t>
+        <w:t xml:space="preserve">Cristobal Oyarzun: Trabajando en registro de empleados</w:t>
       </w:r>
     </w:p>
     <w:p>
@@ -172,7 +172,7 @@
         <w:rPr>
           <w:rtl w:val="0"/>
         </w:rPr>
-        <w:t xml:space="preserve">Cristobal Oyarzun: </w:t>
+        <w:t xml:space="preserve">Cristobal Oyarzun: Gestión de empleados y toma de foto para registro</w:t>
       </w:r>
     </w:p>
     <w:p>

</xml_diff>